<commit_message>
docs: update implementation plan with Phase 1-4 completion status
- Table 2 (Roadmap): Added Status column — 17 segments (1A-4D) marked Done, 11 segments Pending
- Table 3 (Phase Summary): Phases 1-4 updated from Pending to Completed (green)
- Version bumped from 1.0-DRAFT to 1.1 — Progress Update
- Phases 5 (NBR Compliance), 6 (AI & Automation), 7 (Architecture) remain Pending
</commit_message>
<xml_diff>
--- a/docs/InventoryOS_CCTV_Shop_Module_Implementation_Plan.docx
+++ b/docs/InventoryOS_CCTV_Shop_Module_Implementation_Plan.docx
@@ -191,7 +191,7 @@
                 <w:sz w:val="24"/>
                 <w:szCs w:val="24"/>
               </w:rPr>
-              <w:t xml:space="preserve">Version: 1.0-DRAFT</w:t>
+              <w:t>Version: 1.1 — Progress Update</w:t>
             </w:r>
           </w:p>
           <w:p>
@@ -4570,6 +4570,7 @@
         <w:gridCol w:w="100"/>
         <w:gridCol w:w="100"/>
         <w:gridCol w:w="100"/>
+        <w:gridCol w:w="1800"/>
       </w:tblGrid>
       <w:tr>
         <w:trPr>
@@ -4745,6 +4746,29 @@
             </w:r>
           </w:p>
         </w:tc>
+        <w:tc>
+          <w:tcPr>
+            <w:tcW w:type="pct" w:w="20%"/>
+            <w:tcBorders>
+              <w:top w:val="none" w:color="FFFFFF" w:sz="0"/>
+              <w:left w:val="none" w:color="FFFFFF" w:sz="0"/>
+              <w:bottom w:val="single" w:color="DDD0C8" w:sz="1"/>
+              <w:right w:val="none" w:color="FFFFFF" w:sz="0"/>
+            </w:tcBorders>
+            <w:shd w:fill="D4875A" w:val="clear"/>
+            <w:tcMar>
+              <w:top w:type="dxa" w:w="60"/>
+              <w:left w:type="dxa" w:w="120"/>
+              <w:bottom w:type="dxa" w:w="60"/>
+              <w:right w:type="dxa" w:w="120"/>
+            </w:tcMar>
+          </w:tcPr>
+          <w:p>
+            <w:r>
+              <w:t xml:space="preserve">Status</w:t>
+            </w:r>
+          </w:p>
+        </w:tc>
       </w:tr>
       <w:tr>
         <w:trPr>
@@ -4910,6 +4934,36 @@
             </w:r>
           </w:p>
         </w:tc>
+        <w:tc>
+          <w:tcPr>
+            <w:tcW w:type="pct" w:w="20%"/>
+            <w:tcBorders>
+              <w:top w:val="none" w:color="FFFFFF" w:sz="0"/>
+              <w:left w:val="none" w:color="FFFFFF" w:sz="0"/>
+              <w:bottom w:val="single" w:color="DDD0C8" w:sz="1"/>
+              <w:right w:val="none" w:color="FFFFFF" w:sz="0"/>
+            </w:tcBorders>
+            <w:shd w:fill="F8F0EB" w:val="clear"/>
+            <w:tcMar>
+              <w:top w:type="dxa" w:w="60"/>
+              <w:left w:type="dxa" w:w="120"/>
+              <w:bottom w:type="dxa" w:w="60"/>
+              <w:right w:type="dxa" w:w="120"/>
+            </w:tcMar>
+          </w:tcPr>
+          <w:p>
+            <w:pPr>
+              <w:jc w:val="center"/>
+            </w:pPr>
+            <w:r>
+              <w:rPr>
+                <w:b/>
+                <w:color w:val="22863A"/>
+              </w:rPr>
+              <w:t xml:space="preserve">Done</w:t>
+            </w:r>
+          </w:p>
+        </w:tc>
       </w:tr>
       <w:tr>
         <w:trPr>
@@ -5075,6 +5129,36 @@
             </w:r>
           </w:p>
         </w:tc>
+        <w:tc>
+          <w:tcPr>
+            <w:tcW w:type="pct" w:w="20%"/>
+            <w:tcBorders>
+              <w:top w:val="none" w:color="FFFFFF" w:sz="0"/>
+              <w:left w:val="none" w:color="FFFFFF" w:sz="0"/>
+              <w:bottom w:val="single" w:color="DDD0C8" w:sz="1"/>
+              <w:right w:val="none" w:color="FFFFFF" w:sz="0"/>
+            </w:tcBorders>
+            <w:shd w:fill="FFFFFF" w:val="clear"/>
+            <w:tcMar>
+              <w:top w:type="dxa" w:w="60"/>
+              <w:left w:type="dxa" w:w="120"/>
+              <w:bottom w:type="dxa" w:w="60"/>
+              <w:right w:type="dxa" w:w="120"/>
+            </w:tcMar>
+          </w:tcPr>
+          <w:p>
+            <w:pPr>
+              <w:jc w:val="center"/>
+            </w:pPr>
+            <w:r>
+              <w:rPr>
+                <w:b/>
+                <w:color w:val="22863A"/>
+              </w:rPr>
+              <w:t xml:space="preserve">Done</w:t>
+            </w:r>
+          </w:p>
+        </w:tc>
       </w:tr>
       <w:tr>
         <w:trPr>
@@ -5240,6 +5324,36 @@
             </w:r>
           </w:p>
         </w:tc>
+        <w:tc>
+          <w:tcPr>
+            <w:tcW w:type="pct" w:w="20%"/>
+            <w:tcBorders>
+              <w:top w:val="none" w:color="FFFFFF" w:sz="0"/>
+              <w:left w:val="none" w:color="FFFFFF" w:sz="0"/>
+              <w:bottom w:val="single" w:color="DDD0C8" w:sz="1"/>
+              <w:right w:val="none" w:color="FFFFFF" w:sz="0"/>
+            </w:tcBorders>
+            <w:shd w:fill="F8F0EB" w:val="clear"/>
+            <w:tcMar>
+              <w:top w:type="dxa" w:w="60"/>
+              <w:left w:type="dxa" w:w="120"/>
+              <w:bottom w:type="dxa" w:w="60"/>
+              <w:right w:type="dxa" w:w="120"/>
+            </w:tcMar>
+          </w:tcPr>
+          <w:p>
+            <w:pPr>
+              <w:jc w:val="center"/>
+            </w:pPr>
+            <w:r>
+              <w:rPr>
+                <w:b/>
+                <w:color w:val="22863A"/>
+              </w:rPr>
+              <w:t xml:space="preserve">Done</w:t>
+            </w:r>
+          </w:p>
+        </w:tc>
       </w:tr>
       <w:tr>
         <w:trPr>
@@ -5405,6 +5519,36 @@
             </w:r>
           </w:p>
         </w:tc>
+        <w:tc>
+          <w:tcPr>
+            <w:tcW w:type="pct" w:w="20%"/>
+            <w:tcBorders>
+              <w:top w:val="none" w:color="FFFFFF" w:sz="0"/>
+              <w:left w:val="none" w:color="FFFFFF" w:sz="0"/>
+              <w:bottom w:val="single" w:color="DDD0C8" w:sz="1"/>
+              <w:right w:val="none" w:color="FFFFFF" w:sz="0"/>
+            </w:tcBorders>
+            <w:shd w:fill="FFFFFF" w:val="clear"/>
+            <w:tcMar>
+              <w:top w:type="dxa" w:w="60"/>
+              <w:left w:type="dxa" w:w="120"/>
+              <w:bottom w:type="dxa" w:w="60"/>
+              <w:right w:type="dxa" w:w="120"/>
+            </w:tcMar>
+          </w:tcPr>
+          <w:p>
+            <w:pPr>
+              <w:jc w:val="center"/>
+            </w:pPr>
+            <w:r>
+              <w:rPr>
+                <w:b/>
+                <w:color w:val="22863A"/>
+              </w:rPr>
+              <w:t xml:space="preserve">Done</w:t>
+            </w:r>
+          </w:p>
+        </w:tc>
       </w:tr>
       <w:tr>
         <w:trPr>
@@ -5570,6 +5714,36 @@
             </w:r>
           </w:p>
         </w:tc>
+        <w:tc>
+          <w:tcPr>
+            <w:tcW w:type="pct" w:w="20%"/>
+            <w:tcBorders>
+              <w:top w:val="none" w:color="FFFFFF" w:sz="0"/>
+              <w:left w:val="none" w:color="FFFFFF" w:sz="0"/>
+              <w:bottom w:val="single" w:color="DDD0C8" w:sz="1"/>
+              <w:right w:val="none" w:color="FFFFFF" w:sz="0"/>
+            </w:tcBorders>
+            <w:shd w:fill="F8F0EB" w:val="clear"/>
+            <w:tcMar>
+              <w:top w:type="dxa" w:w="60"/>
+              <w:left w:type="dxa" w:w="120"/>
+              <w:bottom w:type="dxa" w:w="60"/>
+              <w:right w:type="dxa" w:w="120"/>
+            </w:tcMar>
+          </w:tcPr>
+          <w:p>
+            <w:pPr>
+              <w:jc w:val="center"/>
+            </w:pPr>
+            <w:r>
+              <w:rPr>
+                <w:b/>
+                <w:color w:val="22863A"/>
+              </w:rPr>
+              <w:t xml:space="preserve">Done</w:t>
+            </w:r>
+          </w:p>
+        </w:tc>
       </w:tr>
       <w:tr>
         <w:trPr>
@@ -5735,6 +5909,36 @@
             </w:r>
           </w:p>
         </w:tc>
+        <w:tc>
+          <w:tcPr>
+            <w:tcW w:type="pct" w:w="20%"/>
+            <w:tcBorders>
+              <w:top w:val="none" w:color="FFFFFF" w:sz="0"/>
+              <w:left w:val="none" w:color="FFFFFF" w:sz="0"/>
+              <w:bottom w:val="single" w:color="DDD0C8" w:sz="1"/>
+              <w:right w:val="none" w:color="FFFFFF" w:sz="0"/>
+            </w:tcBorders>
+            <w:shd w:fill="FFFFFF" w:val="clear"/>
+            <w:tcMar>
+              <w:top w:type="dxa" w:w="60"/>
+              <w:left w:type="dxa" w:w="120"/>
+              <w:bottom w:type="dxa" w:w="60"/>
+              <w:right w:type="dxa" w:w="120"/>
+            </w:tcMar>
+          </w:tcPr>
+          <w:p>
+            <w:pPr>
+              <w:jc w:val="center"/>
+            </w:pPr>
+            <w:r>
+              <w:rPr>
+                <w:b/>
+                <w:color w:val="22863A"/>
+              </w:rPr>
+              <w:t xml:space="preserve">Done</w:t>
+            </w:r>
+          </w:p>
+        </w:tc>
       </w:tr>
       <w:tr>
         <w:trPr>
@@ -5900,6 +6104,36 @@
             </w:r>
           </w:p>
         </w:tc>
+        <w:tc>
+          <w:tcPr>
+            <w:tcW w:type="pct" w:w="20%"/>
+            <w:tcBorders>
+              <w:top w:val="none" w:color="FFFFFF" w:sz="0"/>
+              <w:left w:val="none" w:color="FFFFFF" w:sz="0"/>
+              <w:bottom w:val="single" w:color="DDD0C8" w:sz="1"/>
+              <w:right w:val="none" w:color="FFFFFF" w:sz="0"/>
+            </w:tcBorders>
+            <w:shd w:fill="F8F0EB" w:val="clear"/>
+            <w:tcMar>
+              <w:top w:type="dxa" w:w="60"/>
+              <w:left w:type="dxa" w:w="120"/>
+              <w:bottom w:type="dxa" w:w="60"/>
+              <w:right w:type="dxa" w:w="120"/>
+            </w:tcMar>
+          </w:tcPr>
+          <w:p>
+            <w:pPr>
+              <w:jc w:val="center"/>
+            </w:pPr>
+            <w:r>
+              <w:rPr>
+                <w:b/>
+                <w:color w:val="22863A"/>
+              </w:rPr>
+              <w:t xml:space="preserve">Done</w:t>
+            </w:r>
+          </w:p>
+        </w:tc>
       </w:tr>
       <w:tr>
         <w:trPr>
@@ -6065,6 +6299,36 @@
             </w:r>
           </w:p>
         </w:tc>
+        <w:tc>
+          <w:tcPr>
+            <w:tcW w:type="pct" w:w="20%"/>
+            <w:tcBorders>
+              <w:top w:val="none" w:color="FFFFFF" w:sz="0"/>
+              <w:left w:val="none" w:color="FFFFFF" w:sz="0"/>
+              <w:bottom w:val="single" w:color="DDD0C8" w:sz="1"/>
+              <w:right w:val="none" w:color="FFFFFF" w:sz="0"/>
+            </w:tcBorders>
+            <w:shd w:fill="FFFFFF" w:val="clear"/>
+            <w:tcMar>
+              <w:top w:type="dxa" w:w="60"/>
+              <w:left w:type="dxa" w:w="120"/>
+              <w:bottom w:type="dxa" w:w="60"/>
+              <w:right w:type="dxa" w:w="120"/>
+            </w:tcMar>
+          </w:tcPr>
+          <w:p>
+            <w:pPr>
+              <w:jc w:val="center"/>
+            </w:pPr>
+            <w:r>
+              <w:rPr>
+                <w:b/>
+                <w:color w:val="22863A"/>
+              </w:rPr>
+              <w:t xml:space="preserve">Done</w:t>
+            </w:r>
+          </w:p>
+        </w:tc>
       </w:tr>
       <w:tr>
         <w:trPr>
@@ -6230,6 +6494,36 @@
             </w:r>
           </w:p>
         </w:tc>
+        <w:tc>
+          <w:tcPr>
+            <w:tcW w:type="pct" w:w="20%"/>
+            <w:tcBorders>
+              <w:top w:val="none" w:color="FFFFFF" w:sz="0"/>
+              <w:left w:val="none" w:color="FFFFFF" w:sz="0"/>
+              <w:bottom w:val="single" w:color="DDD0C8" w:sz="1"/>
+              <w:right w:val="none" w:color="FFFFFF" w:sz="0"/>
+            </w:tcBorders>
+            <w:shd w:fill="F8F0EB" w:val="clear"/>
+            <w:tcMar>
+              <w:top w:type="dxa" w:w="60"/>
+              <w:left w:type="dxa" w:w="120"/>
+              <w:bottom w:type="dxa" w:w="60"/>
+              <w:right w:type="dxa" w:w="120"/>
+            </w:tcMar>
+          </w:tcPr>
+          <w:p>
+            <w:pPr>
+              <w:jc w:val="center"/>
+            </w:pPr>
+            <w:r>
+              <w:rPr>
+                <w:b/>
+                <w:color w:val="22863A"/>
+              </w:rPr>
+              <w:t xml:space="preserve">Done</w:t>
+            </w:r>
+          </w:p>
+        </w:tc>
       </w:tr>
       <w:tr>
         <w:trPr>
@@ -6395,6 +6689,36 @@
             </w:r>
           </w:p>
         </w:tc>
+        <w:tc>
+          <w:tcPr>
+            <w:tcW w:type="pct" w:w="20%"/>
+            <w:tcBorders>
+              <w:top w:val="none" w:color="FFFFFF" w:sz="0"/>
+              <w:left w:val="none" w:color="FFFFFF" w:sz="0"/>
+              <w:bottom w:val="single" w:color="DDD0C8" w:sz="1"/>
+              <w:right w:val="none" w:color="FFFFFF" w:sz="0"/>
+            </w:tcBorders>
+            <w:shd w:fill="FFFFFF" w:val="clear"/>
+            <w:tcMar>
+              <w:top w:type="dxa" w:w="60"/>
+              <w:left w:type="dxa" w:w="120"/>
+              <w:bottom w:type="dxa" w:w="60"/>
+              <w:right w:type="dxa" w:w="120"/>
+            </w:tcMar>
+          </w:tcPr>
+          <w:p>
+            <w:pPr>
+              <w:jc w:val="center"/>
+            </w:pPr>
+            <w:r>
+              <w:rPr>
+                <w:b/>
+                <w:color w:val="22863A"/>
+              </w:rPr>
+              <w:t xml:space="preserve">Done</w:t>
+            </w:r>
+          </w:p>
+        </w:tc>
       </w:tr>
       <w:tr>
         <w:trPr>
@@ -6560,6 +6884,36 @@
             </w:r>
           </w:p>
         </w:tc>
+        <w:tc>
+          <w:tcPr>
+            <w:tcW w:type="pct" w:w="20%"/>
+            <w:tcBorders>
+              <w:top w:val="none" w:color="FFFFFF" w:sz="0"/>
+              <w:left w:val="none" w:color="FFFFFF" w:sz="0"/>
+              <w:bottom w:val="single" w:color="DDD0C8" w:sz="1"/>
+              <w:right w:val="none" w:color="FFFFFF" w:sz="0"/>
+            </w:tcBorders>
+            <w:shd w:fill="F8F0EB" w:val="clear"/>
+            <w:tcMar>
+              <w:top w:type="dxa" w:w="60"/>
+              <w:left w:type="dxa" w:w="120"/>
+              <w:bottom w:type="dxa" w:w="60"/>
+              <w:right w:type="dxa" w:w="120"/>
+            </w:tcMar>
+          </w:tcPr>
+          <w:p>
+            <w:pPr>
+              <w:jc w:val="center"/>
+            </w:pPr>
+            <w:r>
+              <w:rPr>
+                <w:b/>
+                <w:color w:val="22863A"/>
+              </w:rPr>
+              <w:t xml:space="preserve">Done</w:t>
+            </w:r>
+          </w:p>
+        </w:tc>
       </w:tr>
       <w:tr>
         <w:trPr>
@@ -6725,6 +7079,36 @@
             </w:r>
           </w:p>
         </w:tc>
+        <w:tc>
+          <w:tcPr>
+            <w:tcW w:type="pct" w:w="20%"/>
+            <w:tcBorders>
+              <w:top w:val="none" w:color="FFFFFF" w:sz="0"/>
+              <w:left w:val="none" w:color="FFFFFF" w:sz="0"/>
+              <w:bottom w:val="single" w:color="DDD0C8" w:sz="1"/>
+              <w:right w:val="none" w:color="FFFFFF" w:sz="0"/>
+            </w:tcBorders>
+            <w:shd w:fill="FFFFFF" w:val="clear"/>
+            <w:tcMar>
+              <w:top w:type="dxa" w:w="60"/>
+              <w:left w:type="dxa" w:w="120"/>
+              <w:bottom w:type="dxa" w:w="60"/>
+              <w:right w:type="dxa" w:w="120"/>
+            </w:tcMar>
+          </w:tcPr>
+          <w:p>
+            <w:pPr>
+              <w:jc w:val="center"/>
+            </w:pPr>
+            <w:r>
+              <w:rPr>
+                <w:b/>
+                <w:color w:val="22863A"/>
+              </w:rPr>
+              <w:t xml:space="preserve">Done</w:t>
+            </w:r>
+          </w:p>
+        </w:tc>
       </w:tr>
       <w:tr>
         <w:trPr>
@@ -6890,6 +7274,36 @@
             </w:r>
           </w:p>
         </w:tc>
+        <w:tc>
+          <w:tcPr>
+            <w:tcW w:type="pct" w:w="20%"/>
+            <w:tcBorders>
+              <w:top w:val="none" w:color="FFFFFF" w:sz="0"/>
+              <w:left w:val="none" w:color="FFFFFF" w:sz="0"/>
+              <w:bottom w:val="single" w:color="DDD0C8" w:sz="1"/>
+              <w:right w:val="none" w:color="FFFFFF" w:sz="0"/>
+            </w:tcBorders>
+            <w:shd w:fill="F8F0EB" w:val="clear"/>
+            <w:tcMar>
+              <w:top w:type="dxa" w:w="60"/>
+              <w:left w:type="dxa" w:w="120"/>
+              <w:bottom w:type="dxa" w:w="60"/>
+              <w:right w:type="dxa" w:w="120"/>
+            </w:tcMar>
+          </w:tcPr>
+          <w:p>
+            <w:pPr>
+              <w:jc w:val="center"/>
+            </w:pPr>
+            <w:r>
+              <w:rPr>
+                <w:b/>
+                <w:color w:val="22863A"/>
+              </w:rPr>
+              <w:t xml:space="preserve">Done</w:t>
+            </w:r>
+          </w:p>
+        </w:tc>
       </w:tr>
       <w:tr>
         <w:trPr>
@@ -7055,6 +7469,36 @@
             </w:r>
           </w:p>
         </w:tc>
+        <w:tc>
+          <w:tcPr>
+            <w:tcW w:type="pct" w:w="20%"/>
+            <w:tcBorders>
+              <w:top w:val="none" w:color="FFFFFF" w:sz="0"/>
+              <w:left w:val="none" w:color="FFFFFF" w:sz="0"/>
+              <w:bottom w:val="single" w:color="DDD0C8" w:sz="1"/>
+              <w:right w:val="none" w:color="FFFFFF" w:sz="0"/>
+            </w:tcBorders>
+            <w:shd w:fill="FFFFFF" w:val="clear"/>
+            <w:tcMar>
+              <w:top w:type="dxa" w:w="60"/>
+              <w:left w:type="dxa" w:w="120"/>
+              <w:bottom w:type="dxa" w:w="60"/>
+              <w:right w:type="dxa" w:w="120"/>
+            </w:tcMar>
+          </w:tcPr>
+          <w:p>
+            <w:pPr>
+              <w:jc w:val="center"/>
+            </w:pPr>
+            <w:r>
+              <w:rPr>
+                <w:b/>
+                <w:color w:val="22863A"/>
+              </w:rPr>
+              <w:t xml:space="preserve">Done</w:t>
+            </w:r>
+          </w:p>
+        </w:tc>
       </w:tr>
       <w:tr>
         <w:trPr>
@@ -7220,6 +7664,36 @@
             </w:r>
           </w:p>
         </w:tc>
+        <w:tc>
+          <w:tcPr>
+            <w:tcW w:type="pct" w:w="20%"/>
+            <w:tcBorders>
+              <w:top w:val="none" w:color="FFFFFF" w:sz="0"/>
+              <w:left w:val="none" w:color="FFFFFF" w:sz="0"/>
+              <w:bottom w:val="single" w:color="DDD0C8" w:sz="1"/>
+              <w:right w:val="none" w:color="FFFFFF" w:sz="0"/>
+            </w:tcBorders>
+            <w:shd w:fill="F8F0EB" w:val="clear"/>
+            <w:tcMar>
+              <w:top w:type="dxa" w:w="60"/>
+              <w:left w:type="dxa" w:w="120"/>
+              <w:bottom w:type="dxa" w:w="60"/>
+              <w:right w:type="dxa" w:w="120"/>
+            </w:tcMar>
+          </w:tcPr>
+          <w:p>
+            <w:pPr>
+              <w:jc w:val="center"/>
+            </w:pPr>
+            <w:r>
+              <w:rPr>
+                <w:b/>
+                <w:color w:val="22863A"/>
+              </w:rPr>
+              <w:t xml:space="preserve">Done</w:t>
+            </w:r>
+          </w:p>
+        </w:tc>
       </w:tr>
       <w:tr>
         <w:trPr>
@@ -7385,6 +7859,36 @@
             </w:r>
           </w:p>
         </w:tc>
+        <w:tc>
+          <w:tcPr>
+            <w:tcW w:type="pct" w:w="20%"/>
+            <w:tcBorders>
+              <w:top w:val="none" w:color="FFFFFF" w:sz="0"/>
+              <w:left w:val="none" w:color="FFFFFF" w:sz="0"/>
+              <w:bottom w:val="single" w:color="DDD0C8" w:sz="1"/>
+              <w:right w:val="none" w:color="FFFFFF" w:sz="0"/>
+            </w:tcBorders>
+            <w:shd w:fill="FFFFFF" w:val="clear"/>
+            <w:tcMar>
+              <w:top w:type="dxa" w:w="60"/>
+              <w:left w:type="dxa" w:w="120"/>
+              <w:bottom w:type="dxa" w:w="60"/>
+              <w:right w:type="dxa" w:w="120"/>
+            </w:tcMar>
+          </w:tcPr>
+          <w:p>
+            <w:pPr>
+              <w:jc w:val="center"/>
+            </w:pPr>
+            <w:r>
+              <w:rPr>
+                <w:b/>
+                <w:color w:val="22863A"/>
+              </w:rPr>
+              <w:t xml:space="preserve">Done</w:t>
+            </w:r>
+          </w:p>
+        </w:tc>
       </w:tr>
       <w:tr>
         <w:trPr>
@@ -7550,6 +8054,36 @@
             </w:r>
           </w:p>
         </w:tc>
+        <w:tc>
+          <w:tcPr>
+            <w:tcW w:type="pct" w:w="20%"/>
+            <w:tcBorders>
+              <w:top w:val="none" w:color="FFFFFF" w:sz="0"/>
+              <w:left w:val="none" w:color="FFFFFF" w:sz="0"/>
+              <w:bottom w:val="single" w:color="DDD0C8" w:sz="1"/>
+              <w:right w:val="none" w:color="FFFFFF" w:sz="0"/>
+            </w:tcBorders>
+            <w:shd w:fill="F8F0EB" w:val="clear"/>
+            <w:tcMar>
+              <w:top w:type="dxa" w:w="60"/>
+              <w:left w:type="dxa" w:w="120"/>
+              <w:bottom w:type="dxa" w:w="60"/>
+              <w:right w:type="dxa" w:w="120"/>
+            </w:tcMar>
+          </w:tcPr>
+          <w:p>
+            <w:pPr>
+              <w:jc w:val="center"/>
+            </w:pPr>
+            <w:r>
+              <w:rPr>
+                <w:b/>
+                <w:color w:val="22863A"/>
+              </w:rPr>
+              <w:t xml:space="preserve">Done</w:t>
+            </w:r>
+          </w:p>
+        </w:tc>
       </w:tr>
       <w:tr>
         <w:trPr>
@@ -7715,6 +8249,36 @@
             </w:r>
           </w:p>
         </w:tc>
+        <w:tc>
+          <w:tcPr>
+            <w:tcW w:type="pct" w:w="20%"/>
+            <w:tcBorders>
+              <w:top w:val="none" w:color="FFFFFF" w:sz="0"/>
+              <w:left w:val="none" w:color="FFFFFF" w:sz="0"/>
+              <w:bottom w:val="single" w:color="DDD0C8" w:sz="1"/>
+              <w:right w:val="none" w:color="FFFFFF" w:sz="0"/>
+            </w:tcBorders>
+            <w:shd w:fill="FFFFFF" w:val="clear"/>
+            <w:tcMar>
+              <w:top w:type="dxa" w:w="60"/>
+              <w:left w:type="dxa" w:w="120"/>
+              <w:bottom w:type="dxa" w:w="60"/>
+              <w:right w:type="dxa" w:w="120"/>
+            </w:tcMar>
+          </w:tcPr>
+          <w:p>
+            <w:pPr>
+              <w:jc w:val="center"/>
+            </w:pPr>
+            <w:r>
+              <w:rPr>
+                <w:b/>
+                <w:color w:val="22863A"/>
+              </w:rPr>
+              <w:t xml:space="preserve">Done</w:t>
+            </w:r>
+          </w:p>
+        </w:tc>
       </w:tr>
       <w:tr>
         <w:trPr>
@@ -7880,6 +8444,36 @@
             </w:r>
           </w:p>
         </w:tc>
+        <w:tc>
+          <w:tcPr>
+            <w:tcW w:type="pct" w:w="20%"/>
+            <w:tcBorders>
+              <w:top w:val="none" w:color="FFFFFF" w:sz="0"/>
+              <w:left w:val="none" w:color="FFFFFF" w:sz="0"/>
+              <w:bottom w:val="single" w:color="DDD0C8" w:sz="1"/>
+              <w:right w:val="none" w:color="FFFFFF" w:sz="0"/>
+            </w:tcBorders>
+            <w:shd w:fill="F8F0EB" w:val="clear"/>
+            <w:tcMar>
+              <w:top w:type="dxa" w:w="60"/>
+              <w:left w:type="dxa" w:w="120"/>
+              <w:bottom w:type="dxa" w:w="60"/>
+              <w:right w:type="dxa" w:w="120"/>
+            </w:tcMar>
+          </w:tcPr>
+          <w:p>
+            <w:pPr>
+              <w:jc w:val="center"/>
+            </w:pPr>
+            <w:r>
+              <w:rPr>
+                <w:b/>
+                <w:color w:val="9B59B6"/>
+              </w:rPr>
+              <w:t xml:space="preserve">Pending</w:t>
+            </w:r>
+          </w:p>
+        </w:tc>
       </w:tr>
       <w:tr>
         <w:trPr>
@@ -8045,6 +8639,36 @@
             </w:r>
           </w:p>
         </w:tc>
+        <w:tc>
+          <w:tcPr>
+            <w:tcW w:type="pct" w:w="20%"/>
+            <w:tcBorders>
+              <w:top w:val="none" w:color="FFFFFF" w:sz="0"/>
+              <w:left w:val="none" w:color="FFFFFF" w:sz="0"/>
+              <w:bottom w:val="single" w:color="DDD0C8" w:sz="1"/>
+              <w:right w:val="none" w:color="FFFFFF" w:sz="0"/>
+            </w:tcBorders>
+            <w:shd w:fill="FFFFFF" w:val="clear"/>
+            <w:tcMar>
+              <w:top w:type="dxa" w:w="60"/>
+              <w:left w:type="dxa" w:w="120"/>
+              <w:bottom w:type="dxa" w:w="60"/>
+              <w:right w:type="dxa" w:w="120"/>
+            </w:tcMar>
+          </w:tcPr>
+          <w:p>
+            <w:pPr>
+              <w:jc w:val="center"/>
+            </w:pPr>
+            <w:r>
+              <w:rPr>
+                <w:b/>
+                <w:color w:val="9B59B6"/>
+              </w:rPr>
+              <w:t xml:space="preserve">Pending</w:t>
+            </w:r>
+          </w:p>
+        </w:tc>
       </w:tr>
       <w:tr>
         <w:trPr>
@@ -8210,6 +8834,36 @@
             </w:r>
           </w:p>
         </w:tc>
+        <w:tc>
+          <w:tcPr>
+            <w:tcW w:type="pct" w:w="20%"/>
+            <w:tcBorders>
+              <w:top w:val="none" w:color="FFFFFF" w:sz="0"/>
+              <w:left w:val="none" w:color="FFFFFF" w:sz="0"/>
+              <w:bottom w:val="single" w:color="DDD0C8" w:sz="1"/>
+              <w:right w:val="none" w:color="FFFFFF" w:sz="0"/>
+            </w:tcBorders>
+            <w:shd w:fill="F8F0EB" w:val="clear"/>
+            <w:tcMar>
+              <w:top w:type="dxa" w:w="60"/>
+              <w:left w:type="dxa" w:w="120"/>
+              <w:bottom w:type="dxa" w:w="60"/>
+              <w:right w:type="dxa" w:w="120"/>
+            </w:tcMar>
+          </w:tcPr>
+          <w:p>
+            <w:pPr>
+              <w:jc w:val="center"/>
+            </w:pPr>
+            <w:r>
+              <w:rPr>
+                <w:b/>
+                <w:color w:val="9B59B6"/>
+              </w:rPr>
+              <w:t xml:space="preserve">Pending</w:t>
+            </w:r>
+          </w:p>
+        </w:tc>
       </w:tr>
       <w:tr>
         <w:trPr>
@@ -8375,6 +9029,36 @@
             </w:r>
           </w:p>
         </w:tc>
+        <w:tc>
+          <w:tcPr>
+            <w:tcW w:type="pct" w:w="20%"/>
+            <w:tcBorders>
+              <w:top w:val="none" w:color="FFFFFF" w:sz="0"/>
+              <w:left w:val="none" w:color="FFFFFF" w:sz="0"/>
+              <w:bottom w:val="single" w:color="DDD0C8" w:sz="1"/>
+              <w:right w:val="none" w:color="FFFFFF" w:sz="0"/>
+            </w:tcBorders>
+            <w:shd w:fill="FFFFFF" w:val="clear"/>
+            <w:tcMar>
+              <w:top w:type="dxa" w:w="60"/>
+              <w:left w:type="dxa" w:w="120"/>
+              <w:bottom w:type="dxa" w:w="60"/>
+              <w:right w:type="dxa" w:w="120"/>
+            </w:tcMar>
+          </w:tcPr>
+          <w:p>
+            <w:pPr>
+              <w:jc w:val="center"/>
+            </w:pPr>
+            <w:r>
+              <w:rPr>
+                <w:b/>
+                <w:color w:val="9B59B6"/>
+              </w:rPr>
+              <w:t xml:space="preserve">Pending</w:t>
+            </w:r>
+          </w:p>
+        </w:tc>
       </w:tr>
       <w:tr>
         <w:trPr>
@@ -8540,6 +9224,36 @@
             </w:r>
           </w:p>
         </w:tc>
+        <w:tc>
+          <w:tcPr>
+            <w:tcW w:type="pct" w:w="20%"/>
+            <w:tcBorders>
+              <w:top w:val="none" w:color="FFFFFF" w:sz="0"/>
+              <w:left w:val="none" w:color="FFFFFF" w:sz="0"/>
+              <w:bottom w:val="single" w:color="DDD0C8" w:sz="1"/>
+              <w:right w:val="none" w:color="FFFFFF" w:sz="0"/>
+            </w:tcBorders>
+            <w:shd w:fill="F8F0EB" w:val="clear"/>
+            <w:tcMar>
+              <w:top w:type="dxa" w:w="60"/>
+              <w:left w:type="dxa" w:w="120"/>
+              <w:bottom w:type="dxa" w:w="60"/>
+              <w:right w:type="dxa" w:w="120"/>
+            </w:tcMar>
+          </w:tcPr>
+          <w:p>
+            <w:pPr>
+              <w:jc w:val="center"/>
+            </w:pPr>
+            <w:r>
+              <w:rPr>
+                <w:b/>
+                <w:color w:val="9B59B6"/>
+              </w:rPr>
+              <w:t xml:space="preserve">Pending</w:t>
+            </w:r>
+          </w:p>
+        </w:tc>
       </w:tr>
       <w:tr>
         <w:trPr>
@@ -8705,6 +9419,36 @@
             </w:r>
           </w:p>
         </w:tc>
+        <w:tc>
+          <w:tcPr>
+            <w:tcW w:type="pct" w:w="20%"/>
+            <w:tcBorders>
+              <w:top w:val="none" w:color="FFFFFF" w:sz="0"/>
+              <w:left w:val="none" w:color="FFFFFF" w:sz="0"/>
+              <w:bottom w:val="single" w:color="DDD0C8" w:sz="1"/>
+              <w:right w:val="none" w:color="FFFFFF" w:sz="0"/>
+            </w:tcBorders>
+            <w:shd w:fill="FFFFFF" w:val="clear"/>
+            <w:tcMar>
+              <w:top w:type="dxa" w:w="60"/>
+              <w:left w:type="dxa" w:w="120"/>
+              <w:bottom w:type="dxa" w:w="60"/>
+              <w:right w:type="dxa" w:w="120"/>
+            </w:tcMar>
+          </w:tcPr>
+          <w:p>
+            <w:pPr>
+              <w:jc w:val="center"/>
+            </w:pPr>
+            <w:r>
+              <w:rPr>
+                <w:b/>
+                <w:color w:val="9B59B6"/>
+              </w:rPr>
+              <w:t xml:space="preserve">Pending</w:t>
+            </w:r>
+          </w:p>
+        </w:tc>
       </w:tr>
       <w:tr>
         <w:trPr>
@@ -8870,6 +9614,36 @@
             </w:r>
           </w:p>
         </w:tc>
+        <w:tc>
+          <w:tcPr>
+            <w:tcW w:type="pct" w:w="20%"/>
+            <w:tcBorders>
+              <w:top w:val="none" w:color="FFFFFF" w:sz="0"/>
+              <w:left w:val="none" w:color="FFFFFF" w:sz="0"/>
+              <w:bottom w:val="single" w:color="DDD0C8" w:sz="1"/>
+              <w:right w:val="none" w:color="FFFFFF" w:sz="0"/>
+            </w:tcBorders>
+            <w:shd w:fill="F8F0EB" w:val="clear"/>
+            <w:tcMar>
+              <w:top w:type="dxa" w:w="60"/>
+              <w:left w:type="dxa" w:w="120"/>
+              <w:bottom w:type="dxa" w:w="60"/>
+              <w:right w:type="dxa" w:w="120"/>
+            </w:tcMar>
+          </w:tcPr>
+          <w:p>
+            <w:pPr>
+              <w:jc w:val="center"/>
+            </w:pPr>
+            <w:r>
+              <w:rPr>
+                <w:b/>
+                <w:color w:val="9B59B6"/>
+              </w:rPr>
+              <w:t xml:space="preserve">Pending</w:t>
+            </w:r>
+          </w:p>
+        </w:tc>
       </w:tr>
       <w:tr>
         <w:trPr>
@@ -9035,6 +9809,36 @@
             </w:r>
           </w:p>
         </w:tc>
+        <w:tc>
+          <w:tcPr>
+            <w:tcW w:type="pct" w:w="20%"/>
+            <w:tcBorders>
+              <w:top w:val="none" w:color="FFFFFF" w:sz="0"/>
+              <w:left w:val="none" w:color="FFFFFF" w:sz="0"/>
+              <w:bottom w:val="single" w:color="DDD0C8" w:sz="1"/>
+              <w:right w:val="none" w:color="FFFFFF" w:sz="0"/>
+            </w:tcBorders>
+            <w:shd w:fill="FFFFFF" w:val="clear"/>
+            <w:tcMar>
+              <w:top w:type="dxa" w:w="60"/>
+              <w:left w:type="dxa" w:w="120"/>
+              <w:bottom w:type="dxa" w:w="60"/>
+              <w:right w:type="dxa" w:w="120"/>
+            </w:tcMar>
+          </w:tcPr>
+          <w:p>
+            <w:pPr>
+              <w:jc w:val="center"/>
+            </w:pPr>
+            <w:r>
+              <w:rPr>
+                <w:b/>
+                <w:color w:val="9B59B6"/>
+              </w:rPr>
+              <w:t xml:space="preserve">Pending</w:t>
+            </w:r>
+          </w:p>
+        </w:tc>
       </w:tr>
       <w:tr>
         <w:trPr>
@@ -9200,6 +10004,36 @@
             </w:r>
           </w:p>
         </w:tc>
+        <w:tc>
+          <w:tcPr>
+            <w:tcW w:type="pct" w:w="20%"/>
+            <w:tcBorders>
+              <w:top w:val="none" w:color="FFFFFF" w:sz="0"/>
+              <w:left w:val="none" w:color="FFFFFF" w:sz="0"/>
+              <w:bottom w:val="single" w:color="DDD0C8" w:sz="1"/>
+              <w:right w:val="none" w:color="FFFFFF" w:sz="0"/>
+            </w:tcBorders>
+            <w:shd w:fill="F8F0EB" w:val="clear"/>
+            <w:tcMar>
+              <w:top w:type="dxa" w:w="60"/>
+              <w:left w:type="dxa" w:w="120"/>
+              <w:bottom w:type="dxa" w:w="60"/>
+              <w:right w:type="dxa" w:w="120"/>
+            </w:tcMar>
+          </w:tcPr>
+          <w:p>
+            <w:pPr>
+              <w:jc w:val="center"/>
+            </w:pPr>
+            <w:r>
+              <w:rPr>
+                <w:b/>
+                <w:color w:val="9B59B6"/>
+              </w:rPr>
+              <w:t xml:space="preserve">Pending</w:t>
+            </w:r>
+          </w:p>
+        </w:tc>
       </w:tr>
       <w:tr>
         <w:trPr>
@@ -9365,6 +10199,36 @@
             </w:r>
           </w:p>
         </w:tc>
+        <w:tc>
+          <w:tcPr>
+            <w:tcW w:type="pct" w:w="20%"/>
+            <w:tcBorders>
+              <w:top w:val="none" w:color="FFFFFF" w:sz="0"/>
+              <w:left w:val="none" w:color="FFFFFF" w:sz="0"/>
+              <w:bottom w:val="single" w:color="DDD0C8" w:sz="1"/>
+              <w:right w:val="none" w:color="FFFFFF" w:sz="0"/>
+            </w:tcBorders>
+            <w:shd w:fill="FFFFFF" w:val="clear"/>
+            <w:tcMar>
+              <w:top w:type="dxa" w:w="60"/>
+              <w:left w:type="dxa" w:w="120"/>
+              <w:bottom w:type="dxa" w:w="60"/>
+              <w:right w:type="dxa" w:w="120"/>
+            </w:tcMar>
+          </w:tcPr>
+          <w:p>
+            <w:pPr>
+              <w:jc w:val="center"/>
+            </w:pPr>
+            <w:r>
+              <w:rPr>
+                <w:b/>
+                <w:color w:val="9B59B6"/>
+              </w:rPr>
+              <w:t xml:space="preserve">Pending</w:t>
+            </w:r>
+          </w:p>
+        </w:tc>
       </w:tr>
       <w:tr>
         <w:trPr>
@@ -9527,6 +10391,36 @@
                 <w:szCs w:val="21"/>
               </w:rPr>
               <w:t xml:space="preserve">Desktop dashboard + charts</w:t>
+            </w:r>
+          </w:p>
+        </w:tc>
+        <w:tc>
+          <w:tcPr>
+            <w:tcW w:type="pct" w:w="20%"/>
+            <w:tcBorders>
+              <w:top w:val="none" w:color="FFFFFF" w:sz="0"/>
+              <w:left w:val="none" w:color="FFFFFF" w:sz="0"/>
+              <w:bottom w:val="single" w:color="DDD0C8" w:sz="1"/>
+              <w:right w:val="none" w:color="FFFFFF" w:sz="0"/>
+            </w:tcBorders>
+            <w:shd w:fill="F8F0EB" w:val="clear"/>
+            <w:tcMar>
+              <w:top w:type="dxa" w:w="60"/>
+              <w:left w:type="dxa" w:w="120"/>
+              <w:bottom w:type="dxa" w:w="60"/>
+              <w:right w:type="dxa" w:w="120"/>
+            </w:tcMar>
+          </w:tcPr>
+          <w:p>
+            <w:pPr>
+              <w:jc w:val="center"/>
+            </w:pPr>
+            <w:r>
+              <w:rPr>
+                <w:b/>
+                <w:color w:val="9B59B6"/>
+              </w:rPr>
+              <w:t xml:space="preserve">Pending</w:t>
             </w:r>
           </w:p>
         </w:tc>
@@ -9828,15 +10722,14 @@
           <w:p>
             <w:pPr>
               <w:spacing w:after="0"/>
-            </w:pPr>
-            <w:r>
-              <w:rPr>
-                <w:rFonts w:ascii="Calibri"/>
-                <w:color w:val="000000"/>
-                <w:sz w:val="21"/>
-                <w:szCs w:val="21"/>
-              </w:rPr>
-              <w:t xml:space="preserve">Pending</w:t>
+              <w:jc w:val="center"/>
+            </w:pPr>
+            <w:r>
+              <w:rPr>
+                <w:b/>
+                <w:color w:val="22863A"/>
+              </w:rPr>
+              <w:t>Completed</w:t>
             </w:r>
           </w:p>
         </w:tc>
@@ -9961,15 +10854,14 @@
           <w:p>
             <w:pPr>
               <w:spacing w:after="0"/>
-            </w:pPr>
-            <w:r>
-              <w:rPr>
-                <w:rFonts w:ascii="Calibri"/>
-                <w:color w:val="000000"/>
-                <w:sz w:val="21"/>
-                <w:szCs w:val="21"/>
-              </w:rPr>
-              <w:t xml:space="preserve">Pending</w:t>
+              <w:jc w:val="center"/>
+            </w:pPr>
+            <w:r>
+              <w:rPr>
+                <w:b/>
+                <w:color w:val="22863A"/>
+              </w:rPr>
+              <w:t>Completed</w:t>
             </w:r>
           </w:p>
         </w:tc>
@@ -10094,15 +10986,14 @@
           <w:p>
             <w:pPr>
               <w:spacing w:after="0"/>
-            </w:pPr>
-            <w:r>
-              <w:rPr>
-                <w:rFonts w:ascii="Calibri"/>
-                <w:color w:val="000000"/>
-                <w:sz w:val="21"/>
-                <w:szCs w:val="21"/>
-              </w:rPr>
-              <w:t xml:space="preserve">Pending</w:t>
+              <w:jc w:val="center"/>
+            </w:pPr>
+            <w:r>
+              <w:rPr>
+                <w:b/>
+                <w:color w:val="22863A"/>
+              </w:rPr>
+              <w:t>Completed</w:t>
             </w:r>
           </w:p>
         </w:tc>
@@ -10227,15 +11118,14 @@
           <w:p>
             <w:pPr>
               <w:spacing w:after="0"/>
-            </w:pPr>
-            <w:r>
-              <w:rPr>
-                <w:rFonts w:ascii="Calibri"/>
-                <w:color w:val="000000"/>
-                <w:sz w:val="21"/>
-                <w:szCs w:val="21"/>
-              </w:rPr>
-              <w:t xml:space="preserve">Pending</w:t>
+              <w:jc w:val="center"/>
+            </w:pPr>
+            <w:r>
+              <w:rPr>
+                <w:b/>
+                <w:color w:val="22863A"/>
+              </w:rPr>
+              <w:t>Completed</w:t>
             </w:r>
           </w:p>
         </w:tc>
@@ -10364,7 +11254,8 @@
             <w:r>
               <w:rPr>
                 <w:rFonts w:ascii="Calibri"/>
-                <w:color w:val="000000"/>
+                <w:b/>
+                <w:color w:val="9B59B6"/>
                 <w:sz w:val="21"/>
                 <w:szCs w:val="21"/>
               </w:rPr>
@@ -10497,7 +11388,8 @@
             <w:r>
               <w:rPr>
                 <w:rFonts w:ascii="Calibri"/>
-                <w:color w:val="000000"/>
+                <w:b/>
+                <w:color w:val="9B59B6"/>
                 <w:sz w:val="21"/>
                 <w:szCs w:val="21"/>
               </w:rPr>
@@ -10630,7 +11522,8 @@
             <w:r>
               <w:rPr>
                 <w:rFonts w:ascii="Calibri"/>
-                <w:color w:val="000000"/>
+                <w:b/>
+                <w:color w:val="9B59B6"/>
                 <w:sz w:val="21"/>
                 <w:szCs w:val="21"/>
               </w:rPr>

</xml_diff>